<commit_message>
change agrr, change fopsavefileedrhandl
</commit_message>
<xml_diff>
--- a/storage/app/admin_fo_agreement.docx
+++ b/storage/app/admin_fo_agreement.docx
@@ -4445,7 +4445,93 @@
           <w:sz w:val="16"/>
           <w:szCs w:val="16"/>
         </w:rPr>
-        <w:t>вартість доставки сплачує Орендар. Р</w:t>
+        <w:t>вартість доставки</w:t>
+      </w:r>
+      <w:r>
+        <w:rPr>
+          <w:rFonts w:ascii="Times New Roman" w:hAnsi="Times New Roman" w:cs="Times New Roman"/>
+          <w:sz w:val="16"/>
+          <w:szCs w:val="16"/>
+          <w:lang w:val="ru-RU"/>
+        </w:rPr>
+        <w:t xml:space="preserve"> </w:t>
+      </w:r>
+      <w:r>
+        <w:rPr>
+          <w:rFonts w:ascii="Times New Roman" w:hAnsi="Times New Roman" w:cs="Times New Roman"/>
+          <w:sz w:val="16"/>
+          <w:szCs w:val="16"/>
+          <w:lang w:val="ru-RU"/>
+        </w:rPr>
+        <w:t xml:space="preserve">та </w:t>
+      </w:r>
+      <w:proofErr w:type="spellStart"/>
+      <w:r>
+        <w:rPr>
+          <w:rFonts w:ascii="Times New Roman" w:hAnsi="Times New Roman" w:cs="Times New Roman"/>
+          <w:sz w:val="16"/>
+          <w:szCs w:val="16"/>
+          <w:lang w:val="ru-RU"/>
+        </w:rPr>
+        <w:t>повернення</w:t>
+      </w:r>
+      <w:proofErr w:type="spellEnd"/>
+      <w:r>
+        <w:rPr>
+          <w:rFonts w:ascii="Times New Roman" w:hAnsi="Times New Roman" w:cs="Times New Roman"/>
+          <w:sz w:val="16"/>
+          <w:szCs w:val="16"/>
+          <w:lang w:val="ru-RU"/>
+        </w:rPr>
+        <w:t xml:space="preserve"> </w:t>
+      </w:r>
+      <w:proofErr w:type="spellStart"/>
+      <w:r>
+        <w:rPr>
+          <w:rFonts w:ascii="Times New Roman" w:hAnsi="Times New Roman" w:cs="Times New Roman"/>
+          <w:sz w:val="16"/>
+          <w:szCs w:val="16"/>
+          <w:lang w:val="ru-RU"/>
+        </w:rPr>
+        <w:t>об'єкту</w:t>
+      </w:r>
+      <w:proofErr w:type="spellEnd"/>
+      <w:r>
+        <w:rPr>
+          <w:rFonts w:ascii="Times New Roman" w:hAnsi="Times New Roman" w:cs="Times New Roman"/>
+          <w:sz w:val="16"/>
+          <w:szCs w:val="16"/>
+          <w:lang w:val="ru-RU"/>
+        </w:rPr>
+        <w:t xml:space="preserve"> </w:t>
+      </w:r>
+      <w:proofErr w:type="spellStart"/>
+      <w:r>
+        <w:rPr>
+          <w:rFonts w:ascii="Times New Roman" w:hAnsi="Times New Roman" w:cs="Times New Roman"/>
+          <w:sz w:val="16"/>
+          <w:szCs w:val="16"/>
+          <w:lang w:val="ru-RU"/>
+        </w:rPr>
+        <w:t>оренди</w:t>
+      </w:r>
+      <w:proofErr w:type="spellEnd"/>
+      <w:r>
+        <w:rPr>
+          <w:rFonts w:ascii="Times New Roman" w:hAnsi="Times New Roman" w:cs="Times New Roman"/>
+          <w:sz w:val="16"/>
+          <w:szCs w:val="16"/>
+          <w:lang w:val="ru-RU"/>
+        </w:rPr>
+        <w:t xml:space="preserve"> </w:t>
+      </w:r>
+      <w:r>
+        <w:rPr>
+          <w:rFonts w:ascii="Times New Roman" w:hAnsi="Times New Roman" w:cs="Times New Roman"/>
+          <w:sz w:val="16"/>
+          <w:szCs w:val="16"/>
+        </w:rPr>
+        <w:t>сплачує Орендар. Р</w:t>
       </w:r>
       <w:r>
         <w:rPr>

</xml_diff>